<commit_message>
Fix lab4 scenarios, add PDFs
</commit_message>
<xml_diff>
--- a/lab4/scenariusz1.docx
+++ b/lab4/scenariusz1.docx
@@ -5,6 +5,7 @@
     <w:p>
       <w:pPr>
         <w:pStyle w:val="Tytu"/>
+        <w:jc w:val="both"/>
       </w:pPr>
       <w:r>
         <w:t xml:space="preserve">1. </w:t>
@@ -19,6 +20,9 @@
       <w:proofErr w:type="spellEnd"/>
     </w:p>
     <w:p>
+      <w:pPr>
+        <w:jc w:val="both"/>
+      </w:pPr>
       <w:r>
         <w:rPr>
           <w:b/>
@@ -27,63 +31,199 @@
         <w:t>Cel sesji:</w:t>
       </w:r>
       <w:r>
-        <w:t xml:space="preserve"> Testujemy intuicyjność arkusza kalkulacyjnego przy zabezpieczaniu i organizowaniu danych. Pamiętaj o głośnym komentowaniu swoich kroków i ewentualnych trudności.</w:t>
+        <w:t xml:space="preserve"> Badamy intuicyjność interfejsu przy formatowaniu warunkowym i zabezpieczaniu danych. Pamiętaj o „myśleniu na głos” – komentuj swoje oczekiwania i wątpliwości podczas wykonywania kolejnych kroków.</w:t>
       </w:r>
     </w:p>
     <w:p>
+      <w:pPr>
+        <w:jc w:val="both"/>
+      </w:pPr>
       <w:r>
         <w:rPr>
           <w:b/>
           <w:bCs/>
         </w:rPr>
-        <w:t>Zadanie 1 (Rozgrzewka)</w:t>
-      </w:r>
-      <w:r>
-        <w:t xml:space="preserve"> Utwórz nowy arkusz kalkulacyjny. W komórkach A1, B1 i C1 wpisz kolejno nagłówki: "Imię", "Nazwisko", "Rola".</w:t>
+        <w:t>Zadanie 1: Przygotowanie danych (Rozgrzewka)</w:t>
+      </w:r>
+      <w:r>
+        <w:t xml:space="preserve"> Twoim pierwszym celem jest stworzenie podstawowej tabeli do pracy. Osiągnij następujący efekt:</w:t>
       </w:r>
     </w:p>
     <w:p>
+      <w:pPr>
+        <w:numPr>
+          <w:ilvl w:val="0"/>
+          <w:numId w:val="2"/>
+        </w:numPr>
+        <w:jc w:val="both"/>
+      </w:pPr>
+      <w:r>
+        <w:t>Utwórz nowy, pusty arkusz kalkulacyjny i nadaj całemu plikowi nazwę „Testy Komponentów”.</w:t>
+      </w:r>
+    </w:p>
+    <w:p>
+      <w:pPr>
+        <w:numPr>
+          <w:ilvl w:val="0"/>
+          <w:numId w:val="2"/>
+        </w:numPr>
+        <w:jc w:val="both"/>
+      </w:pPr>
+      <w:r>
+        <w:t>W pierwszym wierszu stwórz trzy nagłówki kolumn: „Moduł”, „Napięcie (V)” oraz „Status”.</w:t>
+      </w:r>
+    </w:p>
+    <w:p>
+      <w:pPr>
+        <w:numPr>
+          <w:ilvl w:val="0"/>
+          <w:numId w:val="2"/>
+        </w:numPr>
+        <w:jc w:val="both"/>
+      </w:pPr>
+      <w:r>
+        <w:t>Wypełnij trzy kolejne wiersze pod spodem dowolnymi, zmyślonymi danymi.</w:t>
+      </w:r>
+    </w:p>
+    <w:p>
+      <w:pPr>
+        <w:jc w:val="both"/>
+      </w:pPr>
       <w:r>
         <w:rPr>
           <w:b/>
           <w:bCs/>
         </w:rPr>
-        <w:t>Zadanie 2 (Standardowe)</w:t>
-      </w:r>
-      <w:r>
-        <w:t xml:space="preserve"> Wyobraź sobie, że tabela ma setki wierszy i podczas przewijania w dół chcesz cały czas widzieć nagłówki. Zablokuj pierwszy wiersz arkusza w taki sposób, aby zawsze pozostawał widoczny na samej górze ekranu podczas </w:t>
-      </w:r>
-      <w:proofErr w:type="spellStart"/>
-      <w:r>
-        <w:t>scrollowania</w:t>
-      </w:r>
-      <w:proofErr w:type="spellEnd"/>
-      <w:r>
-        <w:t>.</w:t>
+        <w:t>Zadanie 2: Zarządzanie widokiem (Standardowe)</w:t>
+      </w:r>
+      <w:r>
+        <w:t xml:space="preserve"> Przygotuj tabelę do pracy z dużą ilością danych:</w:t>
       </w:r>
     </w:p>
     <w:p>
+      <w:pPr>
+        <w:numPr>
+          <w:ilvl w:val="0"/>
+          <w:numId w:val="3"/>
+        </w:numPr>
+        <w:jc w:val="both"/>
+      </w:pPr>
+      <w:r>
+        <w:t>Zablokuj pierwszy wiersz arkusza w taki sposób, aby nagłówki zawsze pozostawały widoczne na samej górze ekranu podczas przewijania strony w dół.</w:t>
+      </w:r>
+    </w:p>
+    <w:p>
+      <w:pPr>
+        <w:numPr>
+          <w:ilvl w:val="0"/>
+          <w:numId w:val="3"/>
+        </w:numPr>
+        <w:jc w:val="both"/>
+      </w:pPr>
+      <w:r>
+        <w:t>Włącz funkcję filtrowania danych dla wszystkich trzech nagłówków.</w:t>
+      </w:r>
+    </w:p>
+    <w:p>
+      <w:pPr>
+        <w:jc w:val="both"/>
+      </w:pPr>
       <w:r>
         <w:rPr>
           <w:b/>
           <w:bCs/>
         </w:rPr>
-        <w:t>Zadanie 3 (Zwiększony poziom trudności)</w:t>
-      </w:r>
-      <w:r>
-        <w:t xml:space="preserve"> Pracujesz nad tym plikiem z innymi, ale chcesz mieć pewność, że nikt przypadkowo nie zepsuje najważniejszej kolumny. Zabezpiecz całą kolumnę C (Rola) w taki sposób, aby system wyświetlał ostrzeżenie, jeśli ktokolwiek spróbuje zmienić w niej dane.</w:t>
+        <w:t>Zadanie 3: Automatyzacja wizualna (Nietypowe)</w:t>
+      </w:r>
+      <w:r>
+        <w:t xml:space="preserve"> Chcesz, aby usterki od razu rzucały się w oczy. Skonfiguruj arkusz tak, aby:</w:t>
       </w:r>
     </w:p>
     <w:p>
+      <w:pPr>
+        <w:numPr>
+          <w:ilvl w:val="0"/>
+          <w:numId w:val="4"/>
+        </w:numPr>
+        <w:jc w:val="both"/>
+      </w:pPr>
+      <w:r>
+        <w:t>System automatycznie analizował zawartość wpisywaną w kolumnie „Status”.</w:t>
+      </w:r>
+    </w:p>
+    <w:p>
+      <w:pPr>
+        <w:numPr>
+          <w:ilvl w:val="0"/>
+          <w:numId w:val="4"/>
+        </w:numPr>
+        <w:jc w:val="both"/>
+      </w:pPr>
+      <w:r>
+        <w:t>Każda komórka w tej kolumnie zmieniała kolor tła na czerwony, gdy tylko wpisze się w nią słowo „Awaria”.</w:t>
+      </w:r>
+    </w:p>
+    <w:p>
+      <w:pPr>
+        <w:numPr>
+          <w:ilvl w:val="0"/>
+          <w:numId w:val="4"/>
+        </w:numPr>
+        <w:jc w:val="both"/>
+      </w:pPr>
+      <w:r>
+        <w:t>Przetestuj tę regułę, wpisując ręcznie słowo „Awaria” w jednym z wierszy.</w:t>
+      </w:r>
+    </w:p>
+    <w:p>
+      <w:pPr>
+        <w:jc w:val="both"/>
+      </w:pPr>
       <w:r>
         <w:rPr>
           <w:b/>
           <w:bCs/>
         </w:rPr>
-        <w:t>Zadanie 4 (Nietypowe)</w:t>
-      </w:r>
-      <w:r>
-        <w:t xml:space="preserve"> Zauważyłeś, że wczoraj usunąłeś ważne dane i chcesz do nich wrócić. Odszukaj historię zmian tego pliku i przywróć pierwszą, początkową wersję arkusza, w której nie było jeszcze nagłówków.</w:t>
+        <w:t>Zadanie 4: Zabezpieczanie arkusza (Wyraźnie trudniejsze)</w:t>
+      </w:r>
+      <w:r>
+        <w:t xml:space="preserve"> Arkusz będzie współdzielony z zespołem. Ochroń kluczowe dane przed przypadkową zmianą:</w:t>
+      </w:r>
+    </w:p>
+    <w:p>
+      <w:pPr>
+        <w:numPr>
+          <w:ilvl w:val="0"/>
+          <w:numId w:val="5"/>
+        </w:numPr>
+        <w:jc w:val="both"/>
+      </w:pPr>
+      <w:r>
+        <w:t>Załóż systemowe zabezpieczenie na całą kolumnę „Napięcie (V)”.</w:t>
+      </w:r>
+    </w:p>
+    <w:p>
+      <w:pPr>
+        <w:numPr>
+          <w:ilvl w:val="0"/>
+          <w:numId w:val="5"/>
+        </w:numPr>
+        <w:jc w:val="both"/>
+      </w:pPr>
+      <w:r>
+        <w:t>Skonfiguruj to zabezpieczenie tak, aby system pozwalał na edycję tych danych, ale każdorazowo wyświetlał wyraźne ostrzeżenie (komunikat) przed zatwierdzeniem zmiany.</w:t>
+      </w:r>
+    </w:p>
+    <w:p>
+      <w:pPr>
+        <w:numPr>
+          <w:ilvl w:val="0"/>
+          <w:numId w:val="5"/>
+        </w:numPr>
+        <w:jc w:val="both"/>
+      </w:pPr>
+      <w:r>
+        <w:t>Spróbuj zmienić dowolną wartość w tej kolumnie, aby sprawdzić, czy ostrzeżenie faktycznie wyskakuje na ekranie.</w:t>
       </w:r>
     </w:p>
     <w:sectPr>
@@ -187,8 +327,472 @@
       </w:pPr>
     </w:lvl>
   </w:abstractNum>
+  <w:abstractNum w:abstractNumId="1" w15:restartNumberingAfterBreak="0">
+    <w:nsid w:val="256004EA"/>
+    <w:multiLevelType w:val="multilevel"/>
+    <w:tmpl w:val="4E60484E"/>
+    <w:lvl w:ilvl="0">
+      <w:start w:val="1"/>
+      <w:numFmt w:val="decimal"/>
+      <w:lvlText w:val="%1."/>
+      <w:lvlJc w:val="left"/>
+      <w:pPr>
+        <w:tabs>
+          <w:tab w:val="num" w:pos="720"/>
+        </w:tabs>
+        <w:ind w:left="720" w:hanging="360"/>
+      </w:pPr>
+    </w:lvl>
+    <w:lvl w:ilvl="1" w:tentative="1">
+      <w:start w:val="1"/>
+      <w:numFmt w:val="decimal"/>
+      <w:lvlText w:val="%2."/>
+      <w:lvlJc w:val="left"/>
+      <w:pPr>
+        <w:tabs>
+          <w:tab w:val="num" w:pos="1440"/>
+        </w:tabs>
+        <w:ind w:left="1440" w:hanging="360"/>
+      </w:pPr>
+    </w:lvl>
+    <w:lvl w:ilvl="2" w:tentative="1">
+      <w:start w:val="1"/>
+      <w:numFmt w:val="decimal"/>
+      <w:lvlText w:val="%3."/>
+      <w:lvlJc w:val="left"/>
+      <w:pPr>
+        <w:tabs>
+          <w:tab w:val="num" w:pos="2160"/>
+        </w:tabs>
+        <w:ind w:left="2160" w:hanging="360"/>
+      </w:pPr>
+    </w:lvl>
+    <w:lvl w:ilvl="3" w:tentative="1">
+      <w:start w:val="1"/>
+      <w:numFmt w:val="decimal"/>
+      <w:lvlText w:val="%4."/>
+      <w:lvlJc w:val="left"/>
+      <w:pPr>
+        <w:tabs>
+          <w:tab w:val="num" w:pos="2880"/>
+        </w:tabs>
+        <w:ind w:left="2880" w:hanging="360"/>
+      </w:pPr>
+    </w:lvl>
+    <w:lvl w:ilvl="4" w:tentative="1">
+      <w:start w:val="1"/>
+      <w:numFmt w:val="decimal"/>
+      <w:lvlText w:val="%5."/>
+      <w:lvlJc w:val="left"/>
+      <w:pPr>
+        <w:tabs>
+          <w:tab w:val="num" w:pos="3600"/>
+        </w:tabs>
+        <w:ind w:left="3600" w:hanging="360"/>
+      </w:pPr>
+    </w:lvl>
+    <w:lvl w:ilvl="5" w:tentative="1">
+      <w:start w:val="1"/>
+      <w:numFmt w:val="decimal"/>
+      <w:lvlText w:val="%6."/>
+      <w:lvlJc w:val="left"/>
+      <w:pPr>
+        <w:tabs>
+          <w:tab w:val="num" w:pos="4320"/>
+        </w:tabs>
+        <w:ind w:left="4320" w:hanging="360"/>
+      </w:pPr>
+    </w:lvl>
+    <w:lvl w:ilvl="6" w:tentative="1">
+      <w:start w:val="1"/>
+      <w:numFmt w:val="decimal"/>
+      <w:lvlText w:val="%7."/>
+      <w:lvlJc w:val="left"/>
+      <w:pPr>
+        <w:tabs>
+          <w:tab w:val="num" w:pos="5040"/>
+        </w:tabs>
+        <w:ind w:left="5040" w:hanging="360"/>
+      </w:pPr>
+    </w:lvl>
+    <w:lvl w:ilvl="7" w:tentative="1">
+      <w:start w:val="1"/>
+      <w:numFmt w:val="decimal"/>
+      <w:lvlText w:val="%8."/>
+      <w:lvlJc w:val="left"/>
+      <w:pPr>
+        <w:tabs>
+          <w:tab w:val="num" w:pos="5760"/>
+        </w:tabs>
+        <w:ind w:left="5760" w:hanging="360"/>
+      </w:pPr>
+    </w:lvl>
+    <w:lvl w:ilvl="8" w:tentative="1">
+      <w:start w:val="1"/>
+      <w:numFmt w:val="decimal"/>
+      <w:lvlText w:val="%9."/>
+      <w:lvlJc w:val="left"/>
+      <w:pPr>
+        <w:tabs>
+          <w:tab w:val="num" w:pos="6480"/>
+        </w:tabs>
+        <w:ind w:left="6480" w:hanging="360"/>
+      </w:pPr>
+    </w:lvl>
+  </w:abstractNum>
+  <w:abstractNum w:abstractNumId="2" w15:restartNumberingAfterBreak="0">
+    <w:nsid w:val="295425CF"/>
+    <w:multiLevelType w:val="multilevel"/>
+    <w:tmpl w:val="798A183A"/>
+    <w:lvl w:ilvl="0">
+      <w:start w:val="1"/>
+      <w:numFmt w:val="decimal"/>
+      <w:lvlText w:val="%1."/>
+      <w:lvlJc w:val="left"/>
+      <w:pPr>
+        <w:tabs>
+          <w:tab w:val="num" w:pos="720"/>
+        </w:tabs>
+        <w:ind w:left="720" w:hanging="360"/>
+      </w:pPr>
+    </w:lvl>
+    <w:lvl w:ilvl="1" w:tentative="1">
+      <w:start w:val="1"/>
+      <w:numFmt w:val="decimal"/>
+      <w:lvlText w:val="%2."/>
+      <w:lvlJc w:val="left"/>
+      <w:pPr>
+        <w:tabs>
+          <w:tab w:val="num" w:pos="1440"/>
+        </w:tabs>
+        <w:ind w:left="1440" w:hanging="360"/>
+      </w:pPr>
+    </w:lvl>
+    <w:lvl w:ilvl="2" w:tentative="1">
+      <w:start w:val="1"/>
+      <w:numFmt w:val="decimal"/>
+      <w:lvlText w:val="%3."/>
+      <w:lvlJc w:val="left"/>
+      <w:pPr>
+        <w:tabs>
+          <w:tab w:val="num" w:pos="2160"/>
+        </w:tabs>
+        <w:ind w:left="2160" w:hanging="360"/>
+      </w:pPr>
+    </w:lvl>
+    <w:lvl w:ilvl="3" w:tentative="1">
+      <w:start w:val="1"/>
+      <w:numFmt w:val="decimal"/>
+      <w:lvlText w:val="%4."/>
+      <w:lvlJc w:val="left"/>
+      <w:pPr>
+        <w:tabs>
+          <w:tab w:val="num" w:pos="2880"/>
+        </w:tabs>
+        <w:ind w:left="2880" w:hanging="360"/>
+      </w:pPr>
+    </w:lvl>
+    <w:lvl w:ilvl="4" w:tentative="1">
+      <w:start w:val="1"/>
+      <w:numFmt w:val="decimal"/>
+      <w:lvlText w:val="%5."/>
+      <w:lvlJc w:val="left"/>
+      <w:pPr>
+        <w:tabs>
+          <w:tab w:val="num" w:pos="3600"/>
+        </w:tabs>
+        <w:ind w:left="3600" w:hanging="360"/>
+      </w:pPr>
+    </w:lvl>
+    <w:lvl w:ilvl="5" w:tentative="1">
+      <w:start w:val="1"/>
+      <w:numFmt w:val="decimal"/>
+      <w:lvlText w:val="%6."/>
+      <w:lvlJc w:val="left"/>
+      <w:pPr>
+        <w:tabs>
+          <w:tab w:val="num" w:pos="4320"/>
+        </w:tabs>
+        <w:ind w:left="4320" w:hanging="360"/>
+      </w:pPr>
+    </w:lvl>
+    <w:lvl w:ilvl="6" w:tentative="1">
+      <w:start w:val="1"/>
+      <w:numFmt w:val="decimal"/>
+      <w:lvlText w:val="%7."/>
+      <w:lvlJc w:val="left"/>
+      <w:pPr>
+        <w:tabs>
+          <w:tab w:val="num" w:pos="5040"/>
+        </w:tabs>
+        <w:ind w:left="5040" w:hanging="360"/>
+      </w:pPr>
+    </w:lvl>
+    <w:lvl w:ilvl="7" w:tentative="1">
+      <w:start w:val="1"/>
+      <w:numFmt w:val="decimal"/>
+      <w:lvlText w:val="%8."/>
+      <w:lvlJc w:val="left"/>
+      <w:pPr>
+        <w:tabs>
+          <w:tab w:val="num" w:pos="5760"/>
+        </w:tabs>
+        <w:ind w:left="5760" w:hanging="360"/>
+      </w:pPr>
+    </w:lvl>
+    <w:lvl w:ilvl="8" w:tentative="1">
+      <w:start w:val="1"/>
+      <w:numFmt w:val="decimal"/>
+      <w:lvlText w:val="%9."/>
+      <w:lvlJc w:val="left"/>
+      <w:pPr>
+        <w:tabs>
+          <w:tab w:val="num" w:pos="6480"/>
+        </w:tabs>
+        <w:ind w:left="6480" w:hanging="360"/>
+      </w:pPr>
+    </w:lvl>
+  </w:abstractNum>
+  <w:abstractNum w:abstractNumId="3" w15:restartNumberingAfterBreak="0">
+    <w:nsid w:val="41F52729"/>
+    <w:multiLevelType w:val="multilevel"/>
+    <w:tmpl w:val="335A5004"/>
+    <w:lvl w:ilvl="0">
+      <w:start w:val="1"/>
+      <w:numFmt w:val="decimal"/>
+      <w:lvlText w:val="%1."/>
+      <w:lvlJc w:val="left"/>
+      <w:pPr>
+        <w:tabs>
+          <w:tab w:val="num" w:pos="720"/>
+        </w:tabs>
+        <w:ind w:left="720" w:hanging="360"/>
+      </w:pPr>
+    </w:lvl>
+    <w:lvl w:ilvl="1" w:tentative="1">
+      <w:start w:val="1"/>
+      <w:numFmt w:val="decimal"/>
+      <w:lvlText w:val="%2."/>
+      <w:lvlJc w:val="left"/>
+      <w:pPr>
+        <w:tabs>
+          <w:tab w:val="num" w:pos="1440"/>
+        </w:tabs>
+        <w:ind w:left="1440" w:hanging="360"/>
+      </w:pPr>
+    </w:lvl>
+    <w:lvl w:ilvl="2" w:tentative="1">
+      <w:start w:val="1"/>
+      <w:numFmt w:val="decimal"/>
+      <w:lvlText w:val="%3."/>
+      <w:lvlJc w:val="left"/>
+      <w:pPr>
+        <w:tabs>
+          <w:tab w:val="num" w:pos="2160"/>
+        </w:tabs>
+        <w:ind w:left="2160" w:hanging="360"/>
+      </w:pPr>
+    </w:lvl>
+    <w:lvl w:ilvl="3" w:tentative="1">
+      <w:start w:val="1"/>
+      <w:numFmt w:val="decimal"/>
+      <w:lvlText w:val="%4."/>
+      <w:lvlJc w:val="left"/>
+      <w:pPr>
+        <w:tabs>
+          <w:tab w:val="num" w:pos="2880"/>
+        </w:tabs>
+        <w:ind w:left="2880" w:hanging="360"/>
+      </w:pPr>
+    </w:lvl>
+    <w:lvl w:ilvl="4" w:tentative="1">
+      <w:start w:val="1"/>
+      <w:numFmt w:val="decimal"/>
+      <w:lvlText w:val="%5."/>
+      <w:lvlJc w:val="left"/>
+      <w:pPr>
+        <w:tabs>
+          <w:tab w:val="num" w:pos="3600"/>
+        </w:tabs>
+        <w:ind w:left="3600" w:hanging="360"/>
+      </w:pPr>
+    </w:lvl>
+    <w:lvl w:ilvl="5" w:tentative="1">
+      <w:start w:val="1"/>
+      <w:numFmt w:val="decimal"/>
+      <w:lvlText w:val="%6."/>
+      <w:lvlJc w:val="left"/>
+      <w:pPr>
+        <w:tabs>
+          <w:tab w:val="num" w:pos="4320"/>
+        </w:tabs>
+        <w:ind w:left="4320" w:hanging="360"/>
+      </w:pPr>
+    </w:lvl>
+    <w:lvl w:ilvl="6" w:tentative="1">
+      <w:start w:val="1"/>
+      <w:numFmt w:val="decimal"/>
+      <w:lvlText w:val="%7."/>
+      <w:lvlJc w:val="left"/>
+      <w:pPr>
+        <w:tabs>
+          <w:tab w:val="num" w:pos="5040"/>
+        </w:tabs>
+        <w:ind w:left="5040" w:hanging="360"/>
+      </w:pPr>
+    </w:lvl>
+    <w:lvl w:ilvl="7" w:tentative="1">
+      <w:start w:val="1"/>
+      <w:numFmt w:val="decimal"/>
+      <w:lvlText w:val="%8."/>
+      <w:lvlJc w:val="left"/>
+      <w:pPr>
+        <w:tabs>
+          <w:tab w:val="num" w:pos="5760"/>
+        </w:tabs>
+        <w:ind w:left="5760" w:hanging="360"/>
+      </w:pPr>
+    </w:lvl>
+    <w:lvl w:ilvl="8" w:tentative="1">
+      <w:start w:val="1"/>
+      <w:numFmt w:val="decimal"/>
+      <w:lvlText w:val="%9."/>
+      <w:lvlJc w:val="left"/>
+      <w:pPr>
+        <w:tabs>
+          <w:tab w:val="num" w:pos="6480"/>
+        </w:tabs>
+        <w:ind w:left="6480" w:hanging="360"/>
+      </w:pPr>
+    </w:lvl>
+  </w:abstractNum>
+  <w:abstractNum w:abstractNumId="4" w15:restartNumberingAfterBreak="0">
+    <w:nsid w:val="70750805"/>
+    <w:multiLevelType w:val="multilevel"/>
+    <w:tmpl w:val="9CAAA8E4"/>
+    <w:lvl w:ilvl="0">
+      <w:start w:val="1"/>
+      <w:numFmt w:val="decimal"/>
+      <w:lvlText w:val="%1."/>
+      <w:lvlJc w:val="left"/>
+      <w:pPr>
+        <w:tabs>
+          <w:tab w:val="num" w:pos="720"/>
+        </w:tabs>
+        <w:ind w:left="720" w:hanging="360"/>
+      </w:pPr>
+    </w:lvl>
+    <w:lvl w:ilvl="1" w:tentative="1">
+      <w:start w:val="1"/>
+      <w:numFmt w:val="decimal"/>
+      <w:lvlText w:val="%2."/>
+      <w:lvlJc w:val="left"/>
+      <w:pPr>
+        <w:tabs>
+          <w:tab w:val="num" w:pos="1440"/>
+        </w:tabs>
+        <w:ind w:left="1440" w:hanging="360"/>
+      </w:pPr>
+    </w:lvl>
+    <w:lvl w:ilvl="2" w:tentative="1">
+      <w:start w:val="1"/>
+      <w:numFmt w:val="decimal"/>
+      <w:lvlText w:val="%3."/>
+      <w:lvlJc w:val="left"/>
+      <w:pPr>
+        <w:tabs>
+          <w:tab w:val="num" w:pos="2160"/>
+        </w:tabs>
+        <w:ind w:left="2160" w:hanging="360"/>
+      </w:pPr>
+    </w:lvl>
+    <w:lvl w:ilvl="3" w:tentative="1">
+      <w:start w:val="1"/>
+      <w:numFmt w:val="decimal"/>
+      <w:lvlText w:val="%4."/>
+      <w:lvlJc w:val="left"/>
+      <w:pPr>
+        <w:tabs>
+          <w:tab w:val="num" w:pos="2880"/>
+        </w:tabs>
+        <w:ind w:left="2880" w:hanging="360"/>
+      </w:pPr>
+    </w:lvl>
+    <w:lvl w:ilvl="4" w:tentative="1">
+      <w:start w:val="1"/>
+      <w:numFmt w:val="decimal"/>
+      <w:lvlText w:val="%5."/>
+      <w:lvlJc w:val="left"/>
+      <w:pPr>
+        <w:tabs>
+          <w:tab w:val="num" w:pos="3600"/>
+        </w:tabs>
+        <w:ind w:left="3600" w:hanging="360"/>
+      </w:pPr>
+    </w:lvl>
+    <w:lvl w:ilvl="5" w:tentative="1">
+      <w:start w:val="1"/>
+      <w:numFmt w:val="decimal"/>
+      <w:lvlText w:val="%6."/>
+      <w:lvlJc w:val="left"/>
+      <w:pPr>
+        <w:tabs>
+          <w:tab w:val="num" w:pos="4320"/>
+        </w:tabs>
+        <w:ind w:left="4320" w:hanging="360"/>
+      </w:pPr>
+    </w:lvl>
+    <w:lvl w:ilvl="6" w:tentative="1">
+      <w:start w:val="1"/>
+      <w:numFmt w:val="decimal"/>
+      <w:lvlText w:val="%7."/>
+      <w:lvlJc w:val="left"/>
+      <w:pPr>
+        <w:tabs>
+          <w:tab w:val="num" w:pos="5040"/>
+        </w:tabs>
+        <w:ind w:left="5040" w:hanging="360"/>
+      </w:pPr>
+    </w:lvl>
+    <w:lvl w:ilvl="7" w:tentative="1">
+      <w:start w:val="1"/>
+      <w:numFmt w:val="decimal"/>
+      <w:lvlText w:val="%8."/>
+      <w:lvlJc w:val="left"/>
+      <w:pPr>
+        <w:tabs>
+          <w:tab w:val="num" w:pos="5760"/>
+        </w:tabs>
+        <w:ind w:left="5760" w:hanging="360"/>
+      </w:pPr>
+    </w:lvl>
+    <w:lvl w:ilvl="8" w:tentative="1">
+      <w:start w:val="1"/>
+      <w:numFmt w:val="decimal"/>
+      <w:lvlText w:val="%9."/>
+      <w:lvlJc w:val="left"/>
+      <w:pPr>
+        <w:tabs>
+          <w:tab w:val="num" w:pos="6480"/>
+        </w:tabs>
+        <w:ind w:left="6480" w:hanging="360"/>
+      </w:pPr>
+    </w:lvl>
+  </w:abstractNum>
   <w:num w:numId="1" w16cid:durableId="1378893321">
     <w:abstractNumId w:val="0"/>
+  </w:num>
+  <w:num w:numId="2" w16cid:durableId="1661494059">
+    <w:abstractNumId w:val="2"/>
+  </w:num>
+  <w:num w:numId="3" w16cid:durableId="310907565">
+    <w:abstractNumId w:val="3"/>
+  </w:num>
+  <w:num w:numId="4" w16cid:durableId="627510698">
+    <w:abstractNumId w:val="1"/>
+  </w:num>
+  <w:num w:numId="5" w16cid:durableId="1738505030">
+    <w:abstractNumId w:val="4"/>
   </w:num>
 </w:numbering>
 </file>
@@ -796,7 +1400,6 @@
   <w:style w:type="character" w:default="1" w:styleId="Domylnaczcionkaakapitu">
     <w:name w:val="Default Paragraph Font"/>
     <w:uiPriority w:val="1"/>
-    <w:semiHidden/>
     <w:unhideWhenUsed/>
   </w:style>
   <w:style w:type="table" w:default="1" w:styleId="Standardowy">

</xml_diff>